<commit_message>
ci: un solo servicio en Render sirve la API y el frontend
El build de produccion de Angular apunta a /api en el mismo origen
(RNF-08) y se corrige la URL fija de localhost en el detalle de pedido
del admin. El despliegue usa un solo deploy hook y la prueba de carga
apunta al nuevo servicio.
</commit_message>
<xml_diff>
--- a/docs/fase2/Informe_Fase2_E9_E14.docx
+++ b/docs/fase2/Informe_Fase2_E9_E14.docx
@@ -22058,7 +22058,21 @@
           <w:sz w:val="22"/>
           <w:szCs w:val="22"/>
         </w:rPr>
-        <w:t xml:space="preserve">El despliegue usa los Deploy Hooks de Render del backend y del frontend. Guardé esas direcciones como secretos del repositorio para que no queden escritas en el código. Después de desplegar el pipeline espera a que el endpoint de salud del backend responda. Además desactivé el despliegue automático de Render para que solo el pipeline pueda publicar una versión nueva.</w:t>
+        <w:t xml:space="preserve">En producción uso un solo servicio web en Render que compila el backend y el frontend. El servidor Express entrega la API y la aplicación Angular desde la misma dirección. Así se cumple el RNF-08 de origen único y la cookie de sesión funciona sin configuración CORS.</w:t>
+      </w:r>
+    </w:p>
+    <w:p>
+      <w:pPr>
+        <w:spacing w:after="140" w:line="300"/>
+        <w:jc w:val="both"/>
+      </w:pPr>
+      <w:r>
+        <w:rPr>
+          <w:rFonts w:ascii="Calibri" w:cs="Calibri" w:eastAsia="Calibri" w:hAnsi="Calibri"/>
+          <w:sz w:val="22"/>
+          <w:szCs w:val="22"/>
+        </w:rPr>
+        <w:t xml:space="preserve">El despliegue usa el Deploy Hook de Render. Guardé esa dirección como secreto del repositorio para que no quede escrita en el código. Después de desplegar el pipeline espera a que el endpoint de salud responda. Además desactivé el despliegue automático de Render para que solo el pipeline pueda publicar una versión nueva.</w:t>
       </w:r>
     </w:p>
     <w:tbl>
@@ -22137,7 +22151,7 @@
                 <w:sz w:val="19"/>
                 <w:szCs w:val="19"/>
               </w:rPr>
-              <w:t xml:space="preserve">en la misma ejecución sobre main abro el trabajo Despliegue (PROD). Se ven los pasos de despliegue del backend y del frontend junto a la verificación del endpoint de salud.</w:t>
+              <w:t xml:space="preserve">en la misma ejecución sobre main abro el trabajo Despliegue (PROD). Se ve el paso Desplegar en Render junto a la verificación del endpoint de salud.</w:t>
             </w:r>
           </w:p>
         </w:tc>
@@ -22235,7 +22249,7 @@
                 <w:sz w:val="19"/>
                 <w:szCs w:val="19"/>
               </w:rPr>
-              <w:t xml:space="preserve">en dashboard.render.com abro el servicio del backend y entro a la sección Events. Aparece el despliegue con la hora que coincide con la ejecución del pipeline.</w:t>
+              <w:t xml:space="preserve">en dashboard.render.com abro el servicio e-commerce-proyecto-aseguramiento-backend y entro a la sección Events. Aparece el despliegue con la hora que coincide con la ejecución del pipeline.</w:t>
             </w:r>
           </w:p>
         </w:tc>
@@ -22333,7 +22347,7 @@
                 <w:sz w:val="19"/>
                 <w:szCs w:val="19"/>
               </w:rPr>
-              <w:t xml:space="preserve">en GitHub entro a Settings luego Secrets and variables luego Actions. Se ven los nombres SONAR_TOKEN RENDER_DEPLOY_HOOK_BACKEND y RENDER_DEPLOY_HOOK_FRONTEND. GitHub nunca muestra los valores.</w:t>
+              <w:t xml:space="preserve">en GitHub entro a Settings luego Secrets and variables luego Actions. Se ven los nombres SONAR_TOKEN y RENDER_DEPLOY_HOOK. GitHub nunca muestra los valores.</w:t>
             </w:r>
           </w:p>
         </w:tc>
@@ -22659,7 +22673,7 @@
                 <w:sz w:val="19"/>
                 <w:szCs w:val="19"/>
               </w:rPr>
-              <w:t xml:space="preserve">https://e-commerce-backend-2pn0.onrender.com</w:t>
+              <w:t xml:space="preserve">https://e-commerce-proyecto-aseguramiento-backend.onrender.com</w:t>
             </w:r>
           </w:p>
         </w:tc>

</xml_diff>

<commit_message>
docs: informe con hallazgos de SonarCloud y PRs reales
</commit_message>
<xml_diff>
--- a/docs/fase2/Informe_Fase2_E9_E14.docx
+++ b/docs/fase2/Informe_Fase2_E9_E14.docx
@@ -4214,6 +4214,161 @@
                 <w:szCs w:val="19"/>
               </w:rPr>
               <w:t xml:space="preserve">Promoción a producción</w:t>
+            </w:r>
+          </w:p>
+        </w:tc>
+        <w:tc>
+          <w:tcPr>
+            <w:tcW w:type="dxa" w:w="1450"/>
+            <w:tcBorders>
+              <w:top w:val="single" w:color="000000" w:sz="4"/>
+              <w:left w:val="single" w:color="000000" w:sz="4"/>
+              <w:bottom w:val="single" w:color="000000" w:sz="4"/>
+              <w:right w:val="single" w:color="000000" w:sz="4"/>
+            </w:tcBorders>
+            <w:tcMar>
+              <w:top w:type="dxa" w:w="60"/>
+              <w:left w:type="dxa" w:w="100"/>
+              <w:bottom w:type="dxa" w:w="60"/>
+              <w:right w:type="dxa" w:w="100"/>
+            </w:tcMar>
+          </w:tcPr>
+          <w:p>
+            <w:r>
+              <w:rPr>
+                <w:rFonts w:ascii="Calibri" w:cs="Calibri" w:eastAsia="Calibri" w:hAnsi="Calibri"/>
+                <w:b w:val="false"/>
+                <w:bCs w:val="false"/>
+                <w:color w:val="000000"/>
+                <w:sz w:val="19"/>
+                <w:szCs w:val="19"/>
+              </w:rPr>
+              <w:t xml:space="preserve"/>
+            </w:r>
+          </w:p>
+        </w:tc>
+        <w:tc>
+          <w:tcPr>
+            <w:tcW w:type="dxa" w:w="1450"/>
+            <w:tcBorders>
+              <w:top w:val="single" w:color="000000" w:sz="4"/>
+              <w:left w:val="single" w:color="000000" w:sz="4"/>
+              <w:bottom w:val="single" w:color="000000" w:sz="4"/>
+              <w:right w:val="single" w:color="000000" w:sz="4"/>
+            </w:tcBorders>
+            <w:tcMar>
+              <w:top w:type="dxa" w:w="60"/>
+              <w:left w:type="dxa" w:w="100"/>
+              <w:bottom w:type="dxa" w:w="60"/>
+              <w:right w:type="dxa" w:w="100"/>
+            </w:tcMar>
+          </w:tcPr>
+          <w:p>
+            <w:r>
+              <w:rPr>
+                <w:rFonts w:ascii="Calibri" w:cs="Calibri" w:eastAsia="Calibri" w:hAnsi="Calibri"/>
+                <w:b w:val="false"/>
+                <w:bCs w:val="false"/>
+                <w:color w:val="000000"/>
+                <w:sz w:val="19"/>
+                <w:szCs w:val="19"/>
+              </w:rPr>
+              <w:t xml:space="preserve"/>
+            </w:r>
+          </w:p>
+        </w:tc>
+      </w:tr>
+      <w:tr>
+        <w:trPr>
+          <w:tblHeader w:val="false"/>
+        </w:trPr>
+        <w:tc>
+          <w:tcPr>
+            <w:tcW w:type="dxa" w:w="500"/>
+            <w:tcBorders>
+              <w:top w:val="single" w:color="000000" w:sz="4"/>
+              <w:left w:val="single" w:color="000000" w:sz="4"/>
+              <w:bottom w:val="single" w:color="000000" w:sz="4"/>
+              <w:right w:val="single" w:color="000000" w:sz="4"/>
+            </w:tcBorders>
+            <w:tcMar>
+              <w:top w:type="dxa" w:w="60"/>
+              <w:left w:type="dxa" w:w="100"/>
+              <w:bottom w:type="dxa" w:w="60"/>
+              <w:right w:type="dxa" w:w="100"/>
+            </w:tcMar>
+          </w:tcPr>
+          <w:p>
+            <w:r>
+              <w:rPr>
+                <w:rFonts w:ascii="Calibri" w:cs="Calibri" w:eastAsia="Calibri" w:hAnsi="Calibri"/>
+                <w:b w:val="false"/>
+                <w:bCs w:val="false"/>
+                <w:color w:val="000000"/>
+                <w:sz w:val="19"/>
+                <w:szCs w:val="19"/>
+              </w:rPr>
+              <w:t xml:space="preserve">10</w:t>
+            </w:r>
+          </w:p>
+        </w:tc>
+        <w:tc>
+          <w:tcPr>
+            <w:tcW w:type="dxa" w:w="2900"/>
+            <w:tcBorders>
+              <w:top w:val="single" w:color="000000" w:sz="4"/>
+              <w:left w:val="single" w:color="000000" w:sz="4"/>
+              <w:bottom w:val="single" w:color="000000" w:sz="4"/>
+              <w:right w:val="single" w:color="000000" w:sz="4"/>
+            </w:tcBorders>
+            <w:tcMar>
+              <w:top w:type="dxa" w:w="60"/>
+              <w:left w:type="dxa" w:w="100"/>
+              <w:bottom w:type="dxa" w:w="60"/>
+              <w:right w:type="dxa" w:w="100"/>
+            </w:tcMar>
+          </w:tcPr>
+          <w:p>
+            <w:r>
+              <w:rPr>
+                <w:rFonts w:ascii="Calibri" w:cs="Calibri" w:eastAsia="Calibri" w:hAnsi="Calibri"/>
+                <w:b w:val="false"/>
+                <w:bCs w:val="false"/>
+                <w:color w:val="000000"/>
+                <w:sz w:val="19"/>
+                <w:szCs w:val="19"/>
+              </w:rPr>
+              <w:t xml:space="preserve">fix/sonar-main hacia dev</w:t>
+            </w:r>
+          </w:p>
+        </w:tc>
+        <w:tc>
+          <w:tcPr>
+            <w:tcW w:type="dxa" w:w="3060"/>
+            <w:tcBorders>
+              <w:top w:val="single" w:color="000000" w:sz="4"/>
+              <w:left w:val="single" w:color="000000" w:sz="4"/>
+              <w:bottom w:val="single" w:color="000000" w:sz="4"/>
+              <w:right w:val="single" w:color="000000" w:sz="4"/>
+            </w:tcBorders>
+            <w:tcMar>
+              <w:top w:type="dxa" w:w="60"/>
+              <w:left w:type="dxa" w:w="100"/>
+              <w:bottom w:type="dxa" w:w="60"/>
+              <w:right w:type="dxa" w:w="100"/>
+            </w:tcMar>
+          </w:tcPr>
+          <w:p>
+            <w:r>
+              <w:rPr>
+                <w:rFonts w:ascii="Calibri" w:cs="Calibri" w:eastAsia="Calibri" w:hAnsi="Calibri"/>
+                <w:b w:val="false"/>
+                <w:bCs w:val="false"/>
+                <w:color w:val="000000"/>
+                <w:sz w:val="19"/>
+                <w:szCs w:val="19"/>
+              </w:rPr>
+              <w:t xml:space="preserve">Corrección de bugs reportados por SonarCloud en main</w:t>
             </w:r>
           </w:p>
         </w:tc>
@@ -20551,6 +20706,345 @@
         <w:spacing w:after="120"/>
       </w:pPr>
     </w:p>
+    <w:p>
+      <w:pPr>
+        <w:spacing w:after="140" w:line="300"/>
+        <w:jc w:val="both"/>
+      </w:pPr>
+      <w:r>
+        <w:rPr>
+          <w:rFonts w:ascii="Calibri" w:cs="Calibri" w:eastAsia="Calibri" w:hAnsi="Calibri"/>
+          <w:sz w:val="22"/>
+          <w:szCs w:val="22"/>
+        </w:rPr>
+        <w:t xml:space="preserve">Cuando SonarCloud analizó los Pull Requests encontró dos problemas más que corregí:</w:t>
+      </w:r>
+    </w:p>
+    <w:tbl>
+      <w:tblPr>
+        <w:tblW w:type="dxa" w:w="9360"/>
+        <w:tblBorders>
+          <w:top w:val="single" w:color="auto" w:sz="4"/>
+          <w:left w:val="single" w:color="auto" w:sz="4"/>
+          <w:bottom w:val="single" w:color="auto" w:sz="4"/>
+          <w:right w:val="single" w:color="auto" w:sz="4"/>
+          <w:insideH w:val="single" w:color="auto" w:sz="4"/>
+          <w:insideV w:val="single" w:color="auto" w:sz="4"/>
+        </w:tblBorders>
+      </w:tblPr>
+      <w:tblGrid>
+        <w:gridCol w:w="2900"/>
+        <w:gridCol w:w="2200"/>
+        <w:gridCol w:w="4260"/>
+      </w:tblGrid>
+      <w:tr>
+        <w:trPr>
+          <w:tblHeader/>
+        </w:trPr>
+        <w:tc>
+          <w:tcPr>
+            <w:tcW w:type="dxa" w:w="2900"/>
+            <w:tcBorders>
+              <w:top w:val="single" w:color="000000" w:sz="4"/>
+              <w:left w:val="single" w:color="000000" w:sz="4"/>
+              <w:bottom w:val="single" w:color="000000" w:sz="4"/>
+              <w:right w:val="single" w:color="000000" w:sz="4"/>
+            </w:tcBorders>
+            <w:shd w:fill="D9D9D9" w:val="clear"/>
+            <w:tcMar>
+              <w:top w:type="dxa" w:w="60"/>
+              <w:left w:type="dxa" w:w="100"/>
+              <w:bottom w:type="dxa" w:w="60"/>
+              <w:right w:type="dxa" w:w="100"/>
+            </w:tcMar>
+          </w:tcPr>
+          <w:p>
+            <w:r>
+              <w:rPr>
+                <w:rFonts w:ascii="Calibri" w:cs="Calibri" w:eastAsia="Calibri" w:hAnsi="Calibri"/>
+                <w:b/>
+                <w:bCs/>
+                <w:color w:val="000000"/>
+                <w:sz w:val="19"/>
+                <w:szCs w:val="19"/>
+              </w:rPr>
+              <w:t xml:space="preserve">Hallazgo de SonarCloud</w:t>
+            </w:r>
+          </w:p>
+        </w:tc>
+        <w:tc>
+          <w:tcPr>
+            <w:tcW w:type="dxa" w:w="2200"/>
+            <w:tcBorders>
+              <w:top w:val="single" w:color="000000" w:sz="4"/>
+              <w:left w:val="single" w:color="000000" w:sz="4"/>
+              <w:bottom w:val="single" w:color="000000" w:sz="4"/>
+              <w:right w:val="single" w:color="000000" w:sz="4"/>
+            </w:tcBorders>
+            <w:shd w:fill="D9D9D9" w:val="clear"/>
+            <w:tcMar>
+              <w:top w:type="dxa" w:w="60"/>
+              <w:left w:type="dxa" w:w="100"/>
+              <w:bottom w:type="dxa" w:w="60"/>
+              <w:right w:type="dxa" w:w="100"/>
+            </w:tcMar>
+          </w:tcPr>
+          <w:p>
+            <w:r>
+              <w:rPr>
+                <w:rFonts w:ascii="Calibri" w:cs="Calibri" w:eastAsia="Calibri" w:hAnsi="Calibri"/>
+                <w:b/>
+                <w:bCs/>
+                <w:color w:val="000000"/>
+                <w:sz w:val="19"/>
+                <w:szCs w:val="19"/>
+              </w:rPr>
+              <w:t xml:space="preserve">Severidad</w:t>
+            </w:r>
+          </w:p>
+        </w:tc>
+        <w:tc>
+          <w:tcPr>
+            <w:tcW w:type="dxa" w:w="4260"/>
+            <w:tcBorders>
+              <w:top w:val="single" w:color="000000" w:sz="4"/>
+              <w:left w:val="single" w:color="000000" w:sz="4"/>
+              <w:bottom w:val="single" w:color="000000" w:sz="4"/>
+              <w:right w:val="single" w:color="000000" w:sz="4"/>
+            </w:tcBorders>
+            <w:shd w:fill="D9D9D9" w:val="clear"/>
+            <w:tcMar>
+              <w:top w:type="dxa" w:w="60"/>
+              <w:left w:type="dxa" w:w="100"/>
+              <w:bottom w:type="dxa" w:w="60"/>
+              <w:right w:type="dxa" w:w="100"/>
+            </w:tcMar>
+          </w:tcPr>
+          <w:p>
+            <w:r>
+              <w:rPr>
+                <w:rFonts w:ascii="Calibri" w:cs="Calibri" w:eastAsia="Calibri" w:hAnsi="Calibri"/>
+                <w:b/>
+                <w:bCs/>
+                <w:color w:val="000000"/>
+                <w:sz w:val="19"/>
+                <w:szCs w:val="19"/>
+              </w:rPr>
+              <w:t xml:space="preserve">Corrección que apliqué</w:t>
+            </w:r>
+          </w:p>
+        </w:tc>
+      </w:tr>
+      <w:tr>
+        <w:trPr>
+          <w:tblHeader w:val="false"/>
+        </w:trPr>
+        <w:tc>
+          <w:tcPr>
+            <w:tcW w:type="dxa" w:w="2900"/>
+            <w:tcBorders>
+              <w:top w:val="single" w:color="000000" w:sz="4"/>
+              <w:left w:val="single" w:color="000000" w:sz="4"/>
+              <w:bottom w:val="single" w:color="000000" w:sz="4"/>
+              <w:right w:val="single" w:color="000000" w:sz="4"/>
+            </w:tcBorders>
+            <w:tcMar>
+              <w:top w:type="dxa" w:w="60"/>
+              <w:left w:type="dxa" w:w="100"/>
+              <w:bottom w:type="dxa" w:w="60"/>
+              <w:right w:type="dxa" w:w="100"/>
+            </w:tcMar>
+          </w:tcPr>
+          <w:p>
+            <w:r>
+              <w:rPr>
+                <w:rFonts w:ascii="Calibri" w:cs="Calibri" w:eastAsia="Calibri" w:hAnsi="Calibri"/>
+                <w:b w:val="false"/>
+                <w:bCs w:val="false"/>
+                <w:color w:val="000000"/>
+                <w:sz w:val="19"/>
+                <w:szCs w:val="19"/>
+              </w:rPr>
+              <w:t xml:space="preserve">Password hashes should not be disclosed en auth.service.ts</w:t>
+            </w:r>
+          </w:p>
+        </w:tc>
+        <w:tc>
+          <w:tcPr>
+            <w:tcW w:type="dxa" w:w="2200"/>
+            <w:tcBorders>
+              <w:top w:val="single" w:color="000000" w:sz="4"/>
+              <w:left w:val="single" w:color="000000" w:sz="4"/>
+              <w:bottom w:val="single" w:color="000000" w:sz="4"/>
+              <w:right w:val="single" w:color="000000" w:sz="4"/>
+            </w:tcBorders>
+            <w:tcMar>
+              <w:top w:type="dxa" w:w="60"/>
+              <w:left w:type="dxa" w:w="100"/>
+              <w:bottom w:type="dxa" w:w="60"/>
+              <w:right w:type="dxa" w:w="100"/>
+            </w:tcMar>
+          </w:tcPr>
+          <w:p>
+            <w:r>
+              <w:rPr>
+                <w:rFonts w:ascii="Calibri" w:cs="Calibri" w:eastAsia="Calibri" w:hAnsi="Calibri"/>
+                <w:b w:val="false"/>
+                <w:bCs w:val="false"/>
+                <w:color w:val="000000"/>
+                <w:sz w:val="19"/>
+                <w:szCs w:val="19"/>
+              </w:rPr>
+              <w:t xml:space="preserve">Vulnerabilidad alta (calificación de seguridad E)</w:t>
+            </w:r>
+          </w:p>
+        </w:tc>
+        <w:tc>
+          <w:tcPr>
+            <w:tcW w:type="dxa" w:w="4260"/>
+            <w:tcBorders>
+              <w:top w:val="single" w:color="000000" w:sz="4"/>
+              <w:left w:val="single" w:color="000000" w:sz="4"/>
+              <w:bottom w:val="single" w:color="000000" w:sz="4"/>
+              <w:right w:val="single" w:color="000000" w:sz="4"/>
+            </w:tcBorders>
+            <w:tcMar>
+              <w:top w:type="dxa" w:w="60"/>
+              <w:left w:type="dxa" w:w="100"/>
+              <w:bottom w:type="dxa" w:w="60"/>
+              <w:right w:type="dxa" w:w="100"/>
+            </w:tcMar>
+          </w:tcPr>
+          <w:p>
+            <w:r>
+              <w:rPr>
+                <w:rFonts w:ascii="Calibri" w:cs="Calibri" w:eastAsia="Calibri" w:hAnsi="Calibri"/>
+                <w:b w:val="false"/>
+                <w:bCs w:val="false"/>
+                <w:color w:val="000000"/>
+                <w:sz w:val="19"/>
+                <w:szCs w:val="19"/>
+              </w:rPr>
+              <w:t xml:space="preserve">El hash de referencia que uso para que el login tarde lo mismo cuando el correo no existe estaba escrito en el código. Ahora se genera una sola vez al arrancar el servidor a partir de un valor aleatorio.</w:t>
+            </w:r>
+          </w:p>
+        </w:tc>
+      </w:tr>
+      <w:tr>
+        <w:trPr>
+          <w:tblHeader w:val="false"/>
+        </w:trPr>
+        <w:tc>
+          <w:tcPr>
+            <w:tcW w:type="dxa" w:w="2900"/>
+            <w:tcBorders>
+              <w:top w:val="single" w:color="000000" w:sz="4"/>
+              <w:left w:val="single" w:color="000000" w:sz="4"/>
+              <w:bottom w:val="single" w:color="000000" w:sz="4"/>
+              <w:right w:val="single" w:color="000000" w:sz="4"/>
+            </w:tcBorders>
+            <w:tcMar>
+              <w:top w:type="dxa" w:w="60"/>
+              <w:left w:type="dxa" w:w="100"/>
+              <w:bottom w:type="dxa" w:w="60"/>
+              <w:right w:type="dxa" w:w="100"/>
+            </w:tcMar>
+          </w:tcPr>
+          <w:p>
+            <w:r>
+              <w:rPr>
+                <w:rFonts w:ascii="Calibri" w:cs="Calibri" w:eastAsia="Calibri" w:hAnsi="Calibri"/>
+                <w:b w:val="false"/>
+                <w:bCs w:val="false"/>
+                <w:color w:val="000000"/>
+                <w:sz w:val="19"/>
+                <w:szCs w:val="19"/>
+              </w:rPr>
+              <w:t xml:space="preserve">Cobertura de código nuevo de 69 %</w:t>
+            </w:r>
+          </w:p>
+        </w:tc>
+        <w:tc>
+          <w:tcPr>
+            <w:tcW w:type="dxa" w:w="2200"/>
+            <w:tcBorders>
+              <w:top w:val="single" w:color="000000" w:sz="4"/>
+              <w:left w:val="single" w:color="000000" w:sz="4"/>
+              <w:bottom w:val="single" w:color="000000" w:sz="4"/>
+              <w:right w:val="single" w:color="000000" w:sz="4"/>
+            </w:tcBorders>
+            <w:tcMar>
+              <w:top w:type="dxa" w:w="60"/>
+              <w:left w:type="dxa" w:w="100"/>
+              <w:bottom w:type="dxa" w:w="60"/>
+              <w:right w:type="dxa" w:w="100"/>
+            </w:tcMar>
+          </w:tcPr>
+          <w:p>
+            <w:r>
+              <w:rPr>
+                <w:rFonts w:ascii="Calibri" w:cs="Calibri" w:eastAsia="Calibri" w:hAnsi="Calibri"/>
+                <w:b w:val="false"/>
+                <w:bCs w:val="false"/>
+                <w:color w:val="000000"/>
+                <w:sz w:val="19"/>
+                <w:szCs w:val="19"/>
+              </w:rPr>
+              <w:t xml:space="preserve">Condición del quality gate</w:t>
+            </w:r>
+          </w:p>
+        </w:tc>
+        <w:tc>
+          <w:tcPr>
+            <w:tcW w:type="dxa" w:w="4260"/>
+            <w:tcBorders>
+              <w:top w:val="single" w:color="000000" w:sz="4"/>
+              <w:left w:val="single" w:color="000000" w:sz="4"/>
+              <w:bottom w:val="single" w:color="000000" w:sz="4"/>
+              <w:right w:val="single" w:color="000000" w:sz="4"/>
+            </w:tcBorders>
+            <w:tcMar>
+              <w:top w:type="dxa" w:w="60"/>
+              <w:left w:type="dxa" w:w="100"/>
+              <w:bottom w:type="dxa" w:w="60"/>
+              <w:right w:type="dxa" w:w="100"/>
+            </w:tcMar>
+          </w:tcPr>
+          <w:p>
+            <w:r>
+              <w:rPr>
+                <w:rFonts w:ascii="Calibri" w:cs="Calibri" w:eastAsia="Calibri" w:hAnsi="Calibri"/>
+                <w:b w:val="false"/>
+                <w:bCs w:val="false"/>
+                <w:color w:val="000000"/>
+                <w:sz w:val="19"/>
+                <w:szCs w:val="19"/>
+              </w:rPr>
+              <w:t xml:space="preserve">Jest solo medía seis archivos. Amplié la medición a todo el código con lógica y excluí los controladores y rutas porque se verifican con las pruebas de API. La cobertura del código nuevo subió a 96.8 %.</w:t>
+            </w:r>
+          </w:p>
+        </w:tc>
+      </w:tr>
+    </w:tbl>
+    <w:p>
+      <w:pPr>
+        <w:spacing w:after="120"/>
+      </w:pPr>
+    </w:p>
+    <w:p>
+      <w:pPr>
+        <w:spacing w:after="140" w:line="300"/>
+        <w:jc w:val="both"/>
+      </w:pPr>
+      <w:r>
+        <w:rPr>
+          <w:rFonts w:ascii="Calibri" w:cs="Calibri" w:eastAsia="Calibri" w:hAnsi="Calibri"/>
+          <w:sz w:val="22"/>
+          <w:szCs w:val="22"/>
+        </w:rPr>
+        <w:t xml:space="preserve">En el primer análisis de la rama main SonarCloud listó bugs del código original. Corregí tres que eran errores reales en el Pull Request 10: una coma en lugar de punto y coma al invalidar códigos de recuperación; una promesa sin manejar en el script de semillas; un selector repetido en una animación CSS.</w:t>
+      </w:r>
+    </w:p>
     <w:tbl>
       <w:tblPr>
         <w:tblW w:type="dxa" w:w="9360"/>
@@ -20627,7 +21121,7 @@
                 <w:sz w:val="19"/>
                 <w:szCs w:val="19"/>
               </w:rPr>
-              <w:t xml:space="preserve">en SonarCloud entro a Issues con la rama dev (o el Pull Request de feature/e12-sonarcloud). Con el filtro Blocker y Critical la lista queda vacía.</w:t>
+              <w:t xml:space="preserve">en GitHub abro el Pull Request 7 y busco el comentario de SonarCloud con Quality Gate failed y E Security Rating. También aparece en la pestaña Security and quality del repositorio.</w:t>
             </w:r>
           </w:p>
         </w:tc>
@@ -20646,7 +21140,105 @@
           <w:sz w:val="19"/>
           <w:szCs w:val="19"/>
         </w:rPr>
-        <w:t xml:space="preserve">Figura 22. Hallazgos Blocker y Critical después de la remediación.</w:t>
+        <w:t xml:space="preserve">Figura 22. Vulnerabilidad detectada por SonarCloud en el Pull Request.</w:t>
+      </w:r>
+    </w:p>
+    <w:tbl>
+      <w:tblPr>
+        <w:tblW w:type="dxa" w:w="9360"/>
+        <w:tblBorders>
+          <w:top w:val="single" w:color="auto" w:sz="4"/>
+          <w:left w:val="single" w:color="auto" w:sz="4"/>
+          <w:bottom w:val="single" w:color="auto" w:sz="4"/>
+          <w:right w:val="single" w:color="auto" w:sz="4"/>
+          <w:insideH w:val="single" w:color="auto" w:sz="4"/>
+          <w:insideV w:val="single" w:color="auto" w:sz="4"/>
+        </w:tblBorders>
+      </w:tblPr>
+      <w:tblGrid>
+        <w:gridCol w:w="9360"/>
+      </w:tblGrid>
+      <w:tr>
+        <w:trPr>
+          <w:trHeight w:val="3400" w:hRule="atLeast"/>
+        </w:trPr>
+        <w:tc>
+          <w:tcPr>
+            <w:tcW w:type="dxa" w:w="9360"/>
+            <w:tcBorders>
+              <w:top w:val="dashed" w:color="000000" w:sz="8"/>
+              <w:left w:val="dashed" w:color="000000" w:sz="8"/>
+              <w:bottom w:val="dashed" w:color="000000" w:sz="8"/>
+              <w:right w:val="dashed" w:color="000000" w:sz="8"/>
+            </w:tcBorders>
+            <w:shd w:fill="FFFFFF" w:val="clear"/>
+            <w:tcMar>
+              <w:top w:type="dxa" w:w="160"/>
+              <w:left w:type="dxa" w:w="200"/>
+              <w:bottom w:type="dxa" w:w="160"/>
+              <w:right w:type="dxa" w:w="200"/>
+            </w:tcMar>
+          </w:tcPr>
+          <w:p>
+            <w:pPr>
+              <w:spacing w:after="120"/>
+              <w:jc w:val="center"/>
+            </w:pPr>
+            <w:r>
+              <w:rPr>
+                <w:rFonts w:ascii="Calibri" w:cs="Calibri" w:eastAsia="Calibri" w:hAnsi="Calibri"/>
+                <w:b/>
+                <w:bCs/>
+                <w:color w:val="000000"/>
+                <w:sz w:val="22"/>
+                <w:szCs w:val="22"/>
+              </w:rPr>
+              <w:t xml:space="preserve">[ Espacio para la Captura 23 ]</w:t>
+            </w:r>
+          </w:p>
+          <w:p>
+            <w:pPr>
+              <w:spacing w:after="0"/>
+              <w:jc w:val="left"/>
+            </w:pPr>
+            <w:r>
+              <w:rPr>
+                <w:rFonts w:ascii="Calibri" w:cs="Calibri" w:eastAsia="Calibri" w:hAnsi="Calibri"/>
+                <w:b/>
+                <w:bCs/>
+                <w:color w:val="000000"/>
+                <w:sz w:val="19"/>
+                <w:szCs w:val="19"/>
+              </w:rPr>
+              <w:t xml:space="preserve">Dónde encontrarla: </w:t>
+            </w:r>
+            <w:r>
+              <w:rPr>
+                <w:rFonts w:ascii="Calibri" w:cs="Calibri" w:eastAsia="Calibri" w:hAnsi="Calibri"/>
+                <w:color w:val="000000"/>
+                <w:sz w:val="19"/>
+                <w:szCs w:val="19"/>
+              </w:rPr>
+              <w:t xml:space="preserve">en SonarCloud entro a Issues con la rama dev (o el Pull Request de feature/e12-sonarcloud). Con el filtro Blocker y Critical la lista queda vacía.</w:t>
+            </w:r>
+          </w:p>
+        </w:tc>
+      </w:tr>
+    </w:tbl>
+    <w:p>
+      <w:pPr>
+        <w:spacing w:after="240" w:before="80"/>
+        <w:jc w:val="center"/>
+      </w:pPr>
+      <w:r>
+        <w:rPr>
+          <w:rFonts w:ascii="Calibri" w:cs="Calibri" w:eastAsia="Calibri" w:hAnsi="Calibri"/>
+          <w:i/>
+          <w:iCs/>
+          <w:sz w:val="19"/>
+          <w:szCs w:val="19"/>
+        </w:rPr>
+        <w:t xml:space="preserve">Figura 23. Hallazgos Blocker y Critical después de la remediación.</w:t>
       </w:r>
     </w:p>
     <w:p>
@@ -20671,6 +21263,20 @@
         <w:t xml:space="preserve">Usé el quality gate Sonar way. Exige cobertura de al menos 80 % en el código nuevo; duplicación menor a 3 %; calificación A en confiabilidad seguridad y mantenibilidad; todos los puntos de seguridad revisados.</w:t>
       </w:r>
     </w:p>
+    <w:p>
+      <w:pPr>
+        <w:spacing w:after="140" w:line="300"/>
+        <w:jc w:val="both"/>
+      </w:pPr>
+      <w:r>
+        <w:rPr>
+          <w:rFonts w:ascii="Calibri" w:cs="Calibri" w:eastAsia="Calibri" w:hAnsi="Calibri"/>
+          <w:sz w:val="22"/>
+          <w:szCs w:val="22"/>
+        </w:rPr>
+        <w:t xml:space="preserve">El primer análisis de main falló porque SonarCloud tomó todo el código del proyecto como nuevo. Al ejecutarlo de nuevo el código nuevo se comparó contra ese primer análisis y el quality gate quedó aprobado. En los Pull Requests de esta fase el quality gate quedó aprobado con 96.8 % a 100 % de cobertura en código nuevo; 0 % de duplicación; 0 puntos de seguridad pendientes.</w:t>
+      </w:r>
+    </w:p>
     <w:tbl>
       <w:tblPr>
         <w:tblW w:type="dxa" w:w="9360"/>
@@ -20721,7 +21327,7 @@
                 <w:sz w:val="22"/>
                 <w:szCs w:val="22"/>
               </w:rPr>
-              <w:t xml:space="preserve">[ Espacio para la Captura 23 ]</w:t>
+              <w:t xml:space="preserve">[ Espacio para la Captura 24 ]</w:t>
             </w:r>
           </w:p>
           <w:p>
@@ -20766,7 +21372,7 @@
           <w:sz w:val="19"/>
           <w:szCs w:val="19"/>
         </w:rPr>
-        <w:t xml:space="preserve">Figura 23. Quality gate aprobado.</w:t>
+        <w:t xml:space="preserve">Figura 24. Quality gate aprobado.</w:t>
       </w:r>
     </w:p>
     <w:p>
@@ -21642,7 +22248,7 @@
                 <w:sz w:val="22"/>
                 <w:szCs w:val="22"/>
               </w:rPr>
-              <w:t xml:space="preserve">[ Espacio para la Captura 24 ]</w:t>
+              <w:t xml:space="preserve">[ Espacio para la Captura 25 ]</w:t>
             </w:r>
           </w:p>
           <w:p>
@@ -21687,7 +22293,7 @@
           <w:sz w:val="19"/>
           <w:szCs w:val="19"/>
         </w:rPr>
-        <w:t xml:space="preserve">Figura 24. Grafo del pipeline con sus cinco etapas.</w:t>
+        <w:t xml:space="preserve">Figura 25. Grafo del pipeline con sus cinco etapas.</w:t>
       </w:r>
     </w:p>
     <w:p>
@@ -22125,7 +22731,7 @@
                 <w:sz w:val="22"/>
                 <w:szCs w:val="22"/>
               </w:rPr>
-              <w:t xml:space="preserve">[ Espacio para la Captura 25 ]</w:t>
+              <w:t xml:space="preserve">[ Espacio para la Captura 26 ]</w:t>
             </w:r>
           </w:p>
           <w:p>
@@ -22170,7 +22776,7 @@
           <w:sz w:val="19"/>
           <w:szCs w:val="19"/>
         </w:rPr>
-        <w:t xml:space="preserve">Figura 25. Etapa de despliegue completada.</w:t>
+        <w:t xml:space="preserve">Figura 26. Etapa de despliegue completada.</w:t>
       </w:r>
     </w:p>
     <w:tbl>
@@ -22223,7 +22829,7 @@
                 <w:sz w:val="22"/>
                 <w:szCs w:val="22"/>
               </w:rPr>
-              <w:t xml:space="preserve">[ Espacio para la Captura 26 ]</w:t>
+              <w:t xml:space="preserve">[ Espacio para la Captura 27 ]</w:t>
             </w:r>
           </w:p>
           <w:p>
@@ -22268,7 +22874,7 @@
           <w:sz w:val="19"/>
           <w:szCs w:val="19"/>
         </w:rPr>
-        <w:t xml:space="preserve">Figura 26. Despliegue registrado en Render.</w:t>
+        <w:t xml:space="preserve">Figura 27. Despliegue registrado en Render.</w:t>
       </w:r>
     </w:p>
     <w:tbl>
@@ -22321,7 +22927,7 @@
                 <w:sz w:val="22"/>
                 <w:szCs w:val="22"/>
               </w:rPr>
-              <w:t xml:space="preserve">[ Espacio para la Captura 27 ]</w:t>
+              <w:t xml:space="preserve">[ Espacio para la Captura 28 ]</w:t>
             </w:r>
           </w:p>
           <w:p>
@@ -22366,7 +22972,7 @@
           <w:sz w:val="19"/>
           <w:szCs w:val="19"/>
         </w:rPr>
-        <w:t xml:space="preserve">Figura 27. Secretos configurados en GitHub.</w:t>
+        <w:t xml:space="preserve">Figura 28. Secretos configurados en GitHub.</w:t>
       </w:r>
     </w:p>
     <w:p>
@@ -24446,7 +25052,7 @@
                 <w:sz w:val="22"/>
                 <w:szCs w:val="22"/>
               </w:rPr>
-              <w:t xml:space="preserve">[ Espacio para la Captura 28 ]</w:t>
+              <w:t xml:space="preserve">[ Espacio para la Captura 29 ]</w:t>
             </w:r>
           </w:p>
           <w:p>
@@ -24491,7 +25097,7 @@
           <w:sz w:val="19"/>
           <w:szCs w:val="19"/>
         </w:rPr>
-        <w:t xml:space="preserve">Figura 28. Ejecución de la prueba de carga en GitHub Actions.</w:t>
+        <w:t xml:space="preserve">Figura 29. Ejecución de la prueba de carga en GitHub Actions.</w:t>
       </w:r>
     </w:p>
     <w:tbl>
@@ -24544,7 +25150,7 @@
                 <w:sz w:val="22"/>
                 <w:szCs w:val="22"/>
               </w:rPr>
-              <w:t xml:space="preserve">[ Espacio para la Captura 29 ]</w:t>
+              <w:t xml:space="preserve">[ Espacio para la Captura 30 ]</w:t>
             </w:r>
           </w:p>
           <w:p>
@@ -24589,7 +25195,7 @@
           <w:sz w:val="19"/>
           <w:szCs w:val="19"/>
         </w:rPr>
-        <w:t xml:space="preserve">Figura 29. Resumen de métricas generado por k6.</w:t>
+        <w:t xml:space="preserve">Figura 30. Resumen de métricas generado por k6.</w:t>
       </w:r>
     </w:p>
     <w:tbl>
@@ -24642,7 +25248,7 @@
                 <w:sz w:val="22"/>
                 <w:szCs w:val="22"/>
               </w:rPr>
-              <w:t xml:space="preserve">[ Espacio para la Captura 30 ]</w:t>
+              <w:t xml:space="preserve">[ Espacio para la Captura 31 ]</w:t>
             </w:r>
           </w:p>
           <w:p>
@@ -24687,7 +25293,7 @@
           <w:sz w:val="19"/>
           <w:szCs w:val="19"/>
         </w:rPr>
-        <w:t xml:space="preserve">Figura 30. Actividad del servidor en Render durante la prueba.</w:t>
+        <w:t xml:space="preserve">Figura 31. Actividad del servidor en Render durante la prueba.</w:t>
       </w:r>
     </w:p>
     <w:p>

</xml_diff>